<commit_message>
Deixa explícito na Tentativa 1 que o contato é motivado pelo formulário do site
Adiciona uma linha confirmando que a pessoa preencheu o formulário
demonstrando interesse, antes de entrar na dor específica — para que o
primeiro contato não pareça uma abordagem fria.

Co-Authored-By: Claude Sonnet 5 <noreply@anthropic.com>
Claude-Session: https://claude.ai/code/session_01Qco3rELextfq6k1B91gUBk
</commit_message>
<xml_diff>
--- a/strategia-sindicos/comercial/Fluxo_Cadencia_Comercial_Sindico_Profissional.docx
+++ b/strategia-sindicos/comercial/Fluxo_Cadencia_Comercial_Sindico_Profissional.docx
@@ -595,7 +595,7 @@
           <w:b/>
           <w:i w:val="0"/>
         </w:rPr>
-        <w:t>Objetivo: Abrir a conversa já usando o que a pessoa informou no formulário do site (se é morador ou conselheiro, e o tipo de gestão atual)</w:t>
+        <w:t>Objetivo: Abrir a conversa deixando claro que o contato é motivado pelo formulário preenchido no site, já usando o que a pessoa informou (se é morador ou conselheiro, e o tipo de gestão atual)</w:t>
       </w:r>
     </w:p>
     <w:p>
@@ -615,7 +615,7 @@
           <w:b w:val="0"/>
           <w:i w:val="0"/>
         </w:rPr>
-        <w:t>A pessoa já disse no formulário quem ela é (morador ou conselheiro) e como está a gestão hoje (síndico profissional de outra empresa ou síndico morador/voluntário). Use essa informação logo na primeira mensagem — isso mostra que você prestou atenção e já cria identificação.</w:t>
+        <w:t>A pessoa viu um anúncio, entrou no site e preencheu o formulário por vontade própria — ela precisa reconhecer imediatamente o motivo do contato, senão a mensagem soa como abordagem fria. Comece sempre confirmando que ela demonstrou interesse pelo formulário. Em seguida, use o que ela informou (é morador ou conselheiro, e como está a gestão hoje) — isso mostra que você prestou atenção e já cria identificação.</w:t>
       </w:r>
     </w:p>
     <w:p>
@@ -645,7 +645,17 @@
           <w:b w:val="0"/>
           <w:i w:val="0"/>
         </w:rPr>
-        <w:t>Vi que você é morador do [condomínio] e que hoje a gestão é feita por um síndico morador.</w:t>
+        <w:t>Vi aqui que você preencheu nosso formulário no site demonstrando interesse em conhecer a gestão profissional de condomínio — muito bom te encontrar por aqui!</w:t>
+      </w:r>
+    </w:p>
+    <w:p>
+      <w:pPr/>
+      <w:r>
+        <w:rPr>
+          <w:b w:val="0"/>
+          <w:i w:val="0"/>
+        </w:rPr>
+        <w:t>Você é morador do [condomínio], certo? E hoje a gestão é feita por um síndico morador.</w:t>
       </w:r>
     </w:p>
     <w:p>
@@ -685,7 +695,17 @@
           <w:b w:val="0"/>
           <w:i w:val="0"/>
         </w:rPr>
-        <w:t>Vi que o [condomínio] já tem um síndico profissional hoje, mas que você foi buscar mais informações sobre esse serviço mesmo assim.</w:t>
+        <w:t>Vi aqui que você preencheu nosso formulário no site demonstrando interesse em conhecer a gestão profissional de condomínio — muito bom te encontrar por aqui!</w:t>
+      </w:r>
+    </w:p>
+    <w:p>
+      <w:pPr/>
+      <w:r>
+        <w:rPr>
+          <w:b w:val="0"/>
+          <w:i w:val="0"/>
+        </w:rPr>
+        <w:t>Notei que o [condomínio] já tem um síndico profissional hoje, mas que você foi buscar mais informações sobre esse serviço mesmo assim.</w:t>
       </w:r>
     </w:p>
     <w:p>

</xml_diff>

<commit_message>
Reformula Tentativa 2 (ligação): premissa geral de insatisfação, não dor específica do anúncio
A Marcella não tem visibilidade de qual anúncio específico originou
cada lead. Reformula o roteiro da ligação para partir da premissa geral
de que todo lead que chega até a Strategia está, no fundo, insatisfeito
com a gestão atual do condomínio — seja um síndico profissional de
outra empresa, seja um síndico morador — já que todo condomínio é
obrigado por lei a ter um síndico. A situação é sempre sobre trocar de
gestão, e é esse o gancho de abertura da ligação.

Co-Authored-By: Claude Sonnet 5 <noreply@anthropic.com>
Claude-Session: https://claude.ai/code/session_01Qco3rELextfq6k1B91gUBk
</commit_message>
<xml_diff>
--- a/strategia-sindicos/comercial/Fluxo_Cadencia_Comercial_Sindico_Profissional.docx
+++ b/strategia-sindicos/comercial/Fluxo_Cadencia_Comercial_Sindico_Profissional.docx
@@ -738,7 +738,7 @@
           <w:b/>
           <w:i w:val="0"/>
         </w:rPr>
-        <w:t>Objetivo: Primeira tentativa de contato direto, ancorada na dor específica do anúncio que gerou o lead</w:t>
+        <w:t>Objetivo: Primeira tentativa de contato direto, partindo da premissa de que o lead está insatisfeito com a gestão atual do condomínio e quer entender como trocar para a Strategia</w:t>
       </w:r>
     </w:p>
     <w:p>
@@ -758,7 +758,7 @@
           <w:b w:val="0"/>
           <w:i w:val="0"/>
         </w:rPr>
-        <w:t>Confira qual foi o anúncio/campanha que originou o lead — cada anúncio apresenta uma dor específica (inadimplência, conflito entre vizinhos, insegurança jurídica, falta de transparência, etc.). É essa dor que você vai usar como gancho da ligação, não uma abertura genérica.</w:t>
+        <w:t>A Marcella não tem como saber qual foi o anúncio específico que trouxe esse lead — então a ligação não deve tentar "adivinhar" uma dor pontual. Em vez disso, parta da premissa geral que vale pra praticamente todo lead que chega até aqui: todo condomínio é obrigado por lei a ter um síndico, então quem preenche o formulário está, no fundo, insatisfeito com a gestão atual — seja ela feita por um síndico profissional de outra empresa (e tanto ele quanto os moradores estão insatisfeitos), seja por um síndico morador. A situação, na prática, é sempre sobre trocar de síndico. É esse o gancho da ligação.</w:t>
       </w:r>
     </w:p>
     <w:p>
@@ -778,7 +778,7 @@
           <w:b w:val="0"/>
           <w:i w:val="0"/>
         </w:rPr>
-        <w:t>Se apresentar como Marcella, do time Comercial da Strategia Síndicos Profissionais.</w:t>
+        <w:t>Se apresentar como Marcella, do time Comercial da Strategia Síndicos Profissionais, e confirmar que o contato é por causa do formulário preenchido no site.</w:t>
       </w:r>
     </w:p>
     <w:p>
@@ -788,7 +788,7 @@
           <w:b w:val="0"/>
           <w:i w:val="0"/>
         </w:rPr>
-        <w:t>Abrir mencionando diretamente a dor do anúncio: "Vi que você chegou até a gente pelo conteúdo sobre [inadimplência / conflito entre moradores / segurança jurídica / transparência financeira] — é algo que vocês enfrentam aí no condomínio?"</w:t>
+        <w:t>Abrir com a premissa geral: "Pelo que entendi, hoje o condomínio de vocês já tem uma gestão — seja um síndico profissional ou um síndico morador — mas você sentiu vontade de conhecer outras opções. Geralmente isso acontece quando alguma coisa não está funcionando como deveria. Pode me contar um pouco de como está essa situação aí?"</w:t>
       </w:r>
     </w:p>
     <w:p>
@@ -798,7 +798,7 @@
           <w:b w:val="0"/>
           <w:i w:val="0"/>
         </w:rPr>
-        <w:t>Deixar a pessoa confirmar e detalhar a própria dor com as palavras dela — isso é mais forte do que você "adivinhar".</w:t>
+        <w:t>Deixar a pessoa confirmar e detalhar a própria dor e o tipo de gestão atual com as palavras dela — isso é mais forte do que você "adivinhar".</w:t>
       </w:r>
     </w:p>
     <w:p>

</xml_diff>

<commit_message>
Melhora texto da Tentativa 8: destaca satisfação da moradora e fecha com pergunta de agendamento
Reforça que a Cláudia está muito satisfeita com a gestão (4 anos com a
Strategia) e troca o fechamento genérico por uma pergunta direta:
convidar a conversar para explicar como o serviço de síndico
profissional funcionaria para a situação específica do condomínio dela.

Co-Authored-By: Claude Sonnet 5 <noreply@anthropic.com>
Claude-Session: https://claude.ai/code/session_01Qco3rELextfq6k1B91gUBk
</commit_message>
<xml_diff>
--- a/strategia-sindicos/comercial/Fluxo_Cadencia_Comercial_Sindico_Profissional.docx
+++ b/strategia-sindicos/comercial/Fluxo_Cadencia_Comercial_Sindico_Profissional.docx
@@ -1286,7 +1286,7 @@
           <w:b w:val="0"/>
           <w:i w:val="0"/>
         </w:rPr>
-        <w:t>Separei mais um vídeo — a Cláudia é moradora do Condomínio Esturión, em Porto Alegre, e conta como foi a experiência de 4 anos com a gestão da Strategia:</w:t>
+        <w:t>Separei mais um vídeo pra você ver — a Cláudia é moradora do Condomínio Esturión, aqui em Porto Alegre, e está muito satisfeita com a nossa gestão: já são 4 anos com a Strategia cuidando do condomínio dela, e ela conta com detalhes como foi essa experiência.</w:t>
       </w:r>
     </w:p>
     <w:p>
@@ -1316,7 +1316,7 @@
           <w:b w:val="0"/>
           <w:i w:val="0"/>
         </w:rPr>
-        <w:t>"Queria muito entender se ainda faz sentido pra você a gente bater um papo sobre o seu condomínio. Consigo te ajudar a resolver isso antes que vire um problema maior 🙏"</w:t>
+        <w:t>"Podemos conversar melhor pra eu te explicar como o nosso serviço de síndico profissional funcionaria pro seu condomínio, pra sua situação?"</w:t>
       </w:r>
     </w:p>
     <w:p>

</xml_diff>

<commit_message>
Adiciona orientação para preencher a planilha de leads a cada contato
Inclui uma seção logo no início do documento pedindo que cada contato
feito seja registrado na planilha de leads (data, tentativa, canal,
resumo da conversa), com o link direto — tanto para a Marcella se
organizar e não repetir informação com o mesmo lead, quanto para a
Strategia enxergar em qual tentativa cada lead fecha e qual
argumentação funciona melhor. Reforça a mesma orientação nas
Diretrizes gerais.

Co-Authored-By: Claude Sonnet 5 <noreply@anthropic.com>
Claude-Session: https://claude.ai/code/session_01Qco3rELextfq6k1B91gUBk
</commit_message>
<xml_diff>
--- a/strategia-sindicos/comercial/Fluxo_Cadencia_Comercial_Sindico_Profissional.docx
+++ b/strategia-sindicos/comercial/Fluxo_Cadencia_Comercial_Sindico_Profissional.docx
@@ -86,6 +86,34 @@
           <w:i w:val="0"/>
         </w:rPr>
         <w:t>Quando o lead não responde, a cadência usa "cobrança indireta": em vez de perguntar "por que você não respondeu", a mensagem retoma o assunto com um novo gancho de conteúdo, criando uma nova oportunidade de resposta sem soar como cobrança direta.</w:t>
+      </w:r>
+    </w:p>
+    <w:p>
+      <w:pPr>
+        <w:pStyle w:val="Heading2"/>
+      </w:pPr>
+      <w:r>
+        <w:t>Planilha de leads — preencher a cada contato</w:t>
+      </w:r>
+    </w:p>
+    <w:p>
+      <w:pPr/>
+      <w:r>
+        <w:rPr>
+          <w:b/>
+          <w:i w:val="0"/>
+        </w:rPr>
+        <w:t>IMPORTANTE: registre cada contato feito (data, tentativa, canal, resumo do que foi conversado) na planilha de leads assim que ele acontecer. Isso serve pra dois propósitos: você se organiza e não repete a mesma informação ou vídeo com o mesmo lead, e a Strategia consegue enxergar em qual tentativa cada lead está fechando e qual argumentação funcionou melhor.</w:t>
+      </w:r>
+    </w:p>
+    <w:p>
+      <w:pPr/>
+      <w:r>
+        <w:rPr>
+          <w:b/>
+          <w:i w:val="0"/>
+        </w:rPr>
+        <w:t>Link da planilha: https://docs.google.com/spreadsheets/d/1V_uBWuhPYU1KSQYg7Z_MOl22gXaz39htYjYB7mZNRUQ/edit?gid=1229378859#gid=1229378859</w:t>
       </w:r>
     </w:p>
     <w:p>
@@ -3015,6 +3043,14 @@
         <w:pStyle w:val="ListBullet"/>
       </w:pPr>
       <w:r>
+        <w:t>Preencha a planilha de leads (link no início deste documento) logo depois de cada contato — data, tentativa, canal e resumo da conversa. Isso evita repetir informação com o mesmo lead e ajuda a Strategia a entender em qual tentativa cada lead fecha e qual argumentação funciona melhor.</w:t>
+      </w:r>
+    </w:p>
+    <w:p>
+      <w:pPr>
+        <w:pStyle w:val="ListBullet"/>
+      </w:pPr>
+      <w:r>
         <w:t>Sempre comece o primeiro contato usando o que a pessoa já informou no formulário (é morador ou conselheiro, e o tipo de gestão atual) — nunca com uma pergunta genérica de qualificação.</w:t>
       </w:r>
     </w:p>

</xml_diff>

<commit_message>
Remove o termo "reais" ao mencionar depoimentos na Tentativa 3
Ajusta para "depoimentos de moradores" em vez de "depoimentos reais de
moradores" — não existem depoimentos que não sejam reais.

Co-Authored-By: Claude Sonnet 5 <noreply@anthropic.com>
Claude-Session: https://claude.ai/code/session_01Qco3rELextfq6k1B91gUBk
</commit_message>
<xml_diff>
--- a/strategia-sindicos/comercial/Fluxo_Cadencia_Comercial_Sindico_Profissional.docx
+++ b/strategia-sindicos/comercial/Fluxo_Cadencia_Comercial_Sindico_Profissional.docx
@@ -869,7 +869,7 @@
           <w:b/>
           <w:i w:val="0"/>
         </w:rPr>
-        <w:t>Objetivo: Construir autoridade e confiança com prova social real, terminando sempre com uma pergunta que gere ação</w:t>
+        <w:t>Objetivo: Construir autoridade e confiança com prova social, terminando sempre com uma pergunta que gere ação</w:t>
       </w:r>
     </w:p>
     <w:p>
@@ -899,7 +899,7 @@
           <w:b w:val="0"/>
           <w:i w:val="0"/>
         </w:rPr>
-        <w:t>E o mais importante: temos depoimentos reais de moradores super satisfeitos com a gestão. O Carlos, por exemplo, é morador do Edifício Elfrida aqui em Porto Alegre e é nosso cliente há mais de 10 anos!</w:t>
+        <w:t>E o mais importante: temos depoimentos de moradores super satisfeitos com a gestão. O Carlos, por exemplo, é morador do Edifício Elfrida aqui em Porto Alegre e é nosso cliente há mais de 10 anos!</w:t>
       </w:r>
     </w:p>
     <w:p>

</xml_diff>

<commit_message>
Remove menções a "usar a dor do anúncio como gancho" (intro e diretrizes)
Consistente com o ajuste anterior na Tentativa 2: remove a orientação
de usar a dor específica do anúncio como gancho principal, tanto do
parágrafo introdutório quanto do bullet nas Diretrizes gerais.

Co-Authored-By: Claude Sonnet 5 <noreply@anthropic.com>
Claude-Session: https://claude.ai/code/session_01Qco3rELextfq6k1B91gUBk
</commit_message>
<xml_diff>
--- a/strategia-sindicos/comercial/Fluxo_Cadencia_Comercial_Sindico_Profissional.docx
+++ b/strategia-sindicos/comercial/Fluxo_Cadencia_Comercial_Sindico_Profissional.docx
@@ -65,7 +65,7 @@
           <w:b w:val="0"/>
           <w:i w:val="0"/>
         </w:rPr>
-        <w:t>Os anúncios que geram esses leads sempre apresentam uma dor específica que moradores de condomínio costumam ter (inadimplência, conflito entre vizinhos, insegurança jurídica, falta de transparência, etc.) com a Strategia como solução. Use sempre a dor do anúncio que gerou aquele lead como gancho — é a informação mais forte que você tem sobre o motivo do interesse.</w:t>
+        <w:t>Os anúncios que geram esses leads sempre apresentam uma dor específica que moradores de condomínio costumam ter (inadimplência, conflito entre vizinhos, insegurança jurídica, falta de transparência, etc.) com a Strategia como solução.</w:t>
       </w:r>
     </w:p>
     <w:p>
@@ -3059,14 +3059,6 @@
         <w:pStyle w:val="ListBullet"/>
       </w:pPr>
       <w:r>
-        <w:t>Use sempre a dor específica do anúncio que originou o lead como gancho principal — é a informação mais forte que você tem sobre o motivo do interesse.</w:t>
-      </w:r>
-    </w:p>
-    <w:p>
-      <w:pPr>
-        <w:pStyle w:val="ListBullet"/>
-      </w:pPr>
-      <w:r>
         <w:t>Nunca repita o mesmo vídeo de prova social ou o mesmo conteúdo com o mesmo lead — cada tentativa deve trazer algo novo.</w:t>
       </w:r>
     </w:p>

</xml_diff>